<commit_message>
nuevo archido de cv
</commit_message>
<xml_diff>
--- a/src/assets/CV/Fernando_Espiritu_CV.docx
+++ b/src/assets/CV/Fernando_Espiritu_CV.docx
@@ -512,7 +512,23 @@
           <w:szCs w:val="21"/>
           <w:rtl w:val="0"/>
         </w:rPr>
-        <w:t xml:space="preserve">as Agiles (Scrum)</w:t>
+        <w:t xml:space="preserve">as </w:t>
+      </w:r>
+      <w:r>
+        <w:rPr>
+          <w:color w:val="444444"/>
+          <w:rtl w:val="0"/>
+        </w:rPr>
+        <w:t xml:space="preserve">á</w:t>
+      </w:r>
+      <w:r>
+        <w:rPr>
+          <w:color w:val="444444"/>
+          <w:sz w:val="21"/>
+          <w:szCs w:val="21"/>
+          <w:rtl w:val="0"/>
+        </w:rPr>
+        <w:t xml:space="preserve">giles (Scrum)</w:t>
       </w:r>
       <w:r>
         <w:rPr>
@@ -1093,7 +1109,32 @@
           <w:vertAlign w:val="baseline"/>
           <w:rtl w:val="0"/>
         </w:rPr>
-        <w:t xml:space="preserve">Colabore con el equipo de desarrollo utilizando </w:t>
+        <w:t xml:space="preserve">Colabor</w:t>
+      </w:r>
+      <w:r>
+        <w:rPr>
+          <w:rtl w:val="0"/>
+        </w:rPr>
+        <w:t xml:space="preserve">é</w:t>
+      </w:r>
+      <w:r>
+        <w:rPr>
+          <w:rFonts w:ascii="Calibri" w:cs="Calibri" w:eastAsia="Calibri" w:hAnsi="Calibri"/>
+          <w:b w:val="0"/>
+          <w:bCs w:val="0"/>
+          <w:i w:val="0"/>
+          <w:iCs w:val="0"/>
+          <w:smallCaps w:val="0"/>
+          <w:strike w:val="0"/>
+          <w:color w:val="333333"/>
+          <w:sz w:val="21"/>
+          <w:szCs w:val="21"/>
+          <w:u w:val="none"/>
+          <w:shd w:fill="auto" w:val="clear"/>
+          <w:vertAlign w:val="baseline"/>
+          <w:rtl w:val="0"/>
+        </w:rPr>
+        <w:t xml:space="preserve"> con el equipo de desarrollo utilizando </w:t>
       </w:r>
       <w:r>
         <w:rPr>
@@ -1183,7 +1224,7 @@
           <w:szCs w:val="19"/>
           <w:rtl w:val="0"/>
         </w:rPr>
-        <w:t xml:space="preserve">Tecnologias: JavaScript, HTML, CSS, PHP, jQuery, Bootstrap, Oracle Database, CVS</w:t>
+        <w:t xml:space="preserve">Tecnologías: JavaScript, HTML, CSS, PHP, jQuery, Bootstrap, Oracle Database, CVS</w:t>
       </w:r>
       <w:r>
         <w:rPr>
@@ -1434,7 +1475,7 @@
         <w:rPr>
           <w:rtl w:val="0"/>
         </w:rPr>
-        <w:t xml:space="preserve">Diseñe</w:t>
+        <w:t xml:space="preserve">Diseñé</w:t>
       </w:r>
       <w:r>
         <w:rPr>
@@ -1521,7 +1562,82 @@
           <w:vertAlign w:val="baseline"/>
           <w:rtl w:val="0"/>
         </w:rPr>
-        <w:t xml:space="preserve">Integre base de datos SQL para el almacenamiento y consulta de informacion de prestamos y usuarios.</w:t>
+        <w:t xml:space="preserve">Integr</w:t>
+      </w:r>
+      <w:r>
+        <w:rPr>
+          <w:rtl w:val="0"/>
+        </w:rPr>
+        <w:t xml:space="preserve">é</w:t>
+      </w:r>
+      <w:r>
+        <w:rPr>
+          <w:rFonts w:ascii="Calibri" w:cs="Calibri" w:eastAsia="Calibri" w:hAnsi="Calibri"/>
+          <w:b w:val="0"/>
+          <w:bCs w:val="0"/>
+          <w:i w:val="0"/>
+          <w:iCs w:val="0"/>
+          <w:smallCaps w:val="0"/>
+          <w:strike w:val="0"/>
+          <w:color w:val="333333"/>
+          <w:sz w:val="21"/>
+          <w:szCs w:val="21"/>
+          <w:u w:val="none"/>
+          <w:shd w:fill="auto" w:val="clear"/>
+          <w:vertAlign w:val="baseline"/>
+          <w:rtl w:val="0"/>
+        </w:rPr>
+        <w:t xml:space="preserve"> base de datos SQL para el almacenamiento y consulta de informaci</w:t>
+      </w:r>
+      <w:r>
+        <w:rPr>
+          <w:rtl w:val="0"/>
+        </w:rPr>
+        <w:t xml:space="preserve">ó</w:t>
+      </w:r>
+      <w:r>
+        <w:rPr>
+          <w:rFonts w:ascii="Calibri" w:cs="Calibri" w:eastAsia="Calibri" w:hAnsi="Calibri"/>
+          <w:b w:val="0"/>
+          <w:bCs w:val="0"/>
+          <w:i w:val="0"/>
+          <w:iCs w:val="0"/>
+          <w:smallCaps w:val="0"/>
+          <w:strike w:val="0"/>
+          <w:color w:val="333333"/>
+          <w:sz w:val="21"/>
+          <w:szCs w:val="21"/>
+          <w:u w:val="none"/>
+          <w:shd w:fill="auto" w:val="clear"/>
+          <w:vertAlign w:val="baseline"/>
+          <w:rtl w:val="0"/>
+        </w:rPr>
+        <w:t xml:space="preserve">n de </w:t>
+      </w:r>
+      <w:r>
+        <w:rPr>
+          <w:rtl w:val="0"/>
+        </w:rPr>
+        <w:t xml:space="preserve">préstamos</w:t>
+      </w:r>
+      <w:r>
+        <w:rPr>
+          <w:rFonts w:ascii="Calibri" w:cs="Calibri" w:eastAsia="Calibri" w:hAnsi="Calibri"/>
+          <w:b w:val="0"/>
+          <w:bCs w:val="0"/>
+          <w:i w:val="0"/>
+          <w:iCs w:val="0"/>
+          <w:smallCaps w:val="0"/>
+          <w:strike w:val="0"/>
+          <w:color w:val="333333"/>
+          <w:sz w:val="21"/>
+          <w:szCs w:val="21"/>
+          <w:u w:val="none"/>
+          <w:shd w:fill="auto" w:val="clear"/>
+          <w:vertAlign w:val="baseline"/>
+          <w:rtl w:val="0"/>
+        </w:rPr>
+        <w:t xml:space="preserve"> y usuarios.</w:t>
       </w:r>
     </w:p>
     <w:p>
@@ -1536,7 +1652,7 @@
           <w:szCs w:val="19"/>
           <w:rtl w:val="0"/>
         </w:rPr>
-        <w:t xml:space="preserve">Tecnologias: HTML, CSS, Bootstrap, JavaScript, SQL</w:t>
+        <w:t xml:space="preserve">Tecnologías: HTML, CSS, Bootstrap, JavaScript, SQL</w:t>
       </w:r>
       <w:r>
         <w:rPr>
@@ -1622,22 +1738,28 @@
       </w:pPr>
       <w:r>
         <w:rPr>
-          <w:rFonts w:ascii="Calibri" w:cs="Calibri" w:eastAsia="Calibri" w:hAnsi="Calibri"/>
-          <w:b w:val="0"/>
-          <w:bCs w:val="0"/>
-          <w:i w:val="0"/>
-          <w:iCs w:val="0"/>
-          <w:smallCaps w:val="0"/>
-          <w:strike w:val="0"/>
-          <w:color w:val="333333"/>
-          <w:sz w:val="21"/>
-          <w:szCs w:val="21"/>
-          <w:u w:val="none"/>
-          <w:shd w:fill="auto" w:val="clear"/>
-          <w:vertAlign w:val="baseline"/>
-          <w:rtl w:val="0"/>
-        </w:rPr>
-        <w:t xml:space="preserve">Automatice la descarga de datos de estaciones </w:t>
+          <w:rtl w:val="0"/>
+        </w:rPr>
+        <w:t xml:space="preserve">Automaticé</w:t>
+      </w:r>
+      <w:r>
+        <w:rPr>
+          <w:rFonts w:ascii="Calibri" w:cs="Calibri" w:eastAsia="Calibri" w:hAnsi="Calibri"/>
+          <w:b w:val="0"/>
+          <w:bCs w:val="0"/>
+          <w:i w:val="0"/>
+          <w:iCs w:val="0"/>
+          <w:smallCaps w:val="0"/>
+          <w:strike w:val="0"/>
+          <w:color w:val="333333"/>
+          <w:sz w:val="21"/>
+          <w:szCs w:val="21"/>
+          <w:u w:val="none"/>
+          <w:shd w:fill="auto" w:val="clear"/>
+          <w:vertAlign w:val="baseline"/>
+          <w:rtl w:val="0"/>
+        </w:rPr>
+        <w:t xml:space="preserve"> la descarga de datos de estaciones </w:t>
       </w:r>
       <w:r>
         <w:rPr>
@@ -1687,7 +1809,32 @@
           <w:vertAlign w:val="baseline"/>
           <w:rtl w:val="0"/>
         </w:rPr>
-        <w:t xml:space="preserve"> de informacion.</w:t>
+        <w:t xml:space="preserve"> de informaci</w:t>
+      </w:r>
+      <w:r>
+        <w:rPr>
+          <w:rtl w:val="0"/>
+        </w:rPr>
+        <w:t xml:space="preserve">ó</w:t>
+      </w:r>
+      <w:r>
+        <w:rPr>
+          <w:rFonts w:ascii="Calibri" w:cs="Calibri" w:eastAsia="Calibri" w:hAnsi="Calibri"/>
+          <w:b w:val="0"/>
+          <w:bCs w:val="0"/>
+          <w:i w:val="0"/>
+          <w:iCs w:val="0"/>
+          <w:smallCaps w:val="0"/>
+          <w:strike w:val="0"/>
+          <w:color w:val="333333"/>
+          <w:sz w:val="21"/>
+          <w:szCs w:val="21"/>
+          <w:u w:val="none"/>
+          <w:shd w:fill="auto" w:val="clear"/>
+          <w:vertAlign w:val="baseline"/>
+          <w:rtl w:val="0"/>
+        </w:rPr>
+        <w:t xml:space="preserve">n.</w:t>
       </w:r>
     </w:p>
     <w:p>
@@ -1730,7 +1877,32 @@
           <w:vertAlign w:val="baseline"/>
           <w:rtl w:val="0"/>
         </w:rPr>
-        <w:t xml:space="preserve">Brinde mantenimiento preventivo y correctivo a equipos de </w:t>
+        <w:t xml:space="preserve">Brind</w:t>
+      </w:r>
+      <w:r>
+        <w:rPr>
+          <w:rtl w:val="0"/>
+        </w:rPr>
+        <w:t xml:space="preserve">é</w:t>
+      </w:r>
+      <w:r>
+        <w:rPr>
+          <w:rFonts w:ascii="Calibri" w:cs="Calibri" w:eastAsia="Calibri" w:hAnsi="Calibri"/>
+          <w:b w:val="0"/>
+          <w:bCs w:val="0"/>
+          <w:i w:val="0"/>
+          <w:iCs w:val="0"/>
+          <w:smallCaps w:val="0"/>
+          <w:strike w:val="0"/>
+          <w:color w:val="333333"/>
+          <w:sz w:val="21"/>
+          <w:szCs w:val="21"/>
+          <w:u w:val="none"/>
+          <w:shd w:fill="auto" w:val="clear"/>
+          <w:vertAlign w:val="baseline"/>
+          <w:rtl w:val="0"/>
+        </w:rPr>
+        <w:t xml:space="preserve"> mantenimiento preventivo y correctivo a equipos de </w:t>
       </w:r>
       <w:r>
         <w:rPr>
@@ -1825,7 +1997,7 @@
           <w:szCs w:val="23"/>
           <w:rtl w:val="0"/>
         </w:rPr>
-        <w:t xml:space="preserve">EDUCACION</w:t>
+        <w:t xml:space="preserve">EDUCACIÓN</w:t>
       </w:r>
       <w:r>
         <w:rPr>
@@ -1935,7 +2107,21 @@
           <w:szCs w:val="21"/>
           <w:rtl w:val="0"/>
         </w:rPr>
-        <w:t xml:space="preserve">Espanol: Nativo   |   Ingl</w:t>
+        <w:t xml:space="preserve">Espa</w:t>
+      </w:r>
+      <w:r>
+        <w:rPr>
+          <w:rtl w:val="0"/>
+        </w:rPr>
+        <w:t xml:space="preserve">ñ</w:t>
+      </w:r>
+      <w:r>
+        <w:rPr>
+          <w:sz w:val="21"/>
+          <w:szCs w:val="21"/>
+          <w:rtl w:val="0"/>
+        </w:rPr>
+        <w:t xml:space="preserve">ol: Nativo   |   Ingl</w:t>
       </w:r>
       <w:r>
         <w:rPr>
@@ -1949,7 +2135,21 @@
           <w:szCs w:val="21"/>
           <w:rtl w:val="0"/>
         </w:rPr>
-        <w:t xml:space="preserve">s: Basico (en desarrollo activo)</w:t>
+        <w:t xml:space="preserve">s: </w:t>
+      </w:r>
+      <w:r>
+        <w:rPr>
+          <w:rtl w:val="0"/>
+        </w:rPr>
+        <w:t xml:space="preserve">Básico</w:t>
+      </w:r>
+      <w:r>
+        <w:rPr>
+          <w:sz w:val="21"/>
+          <w:szCs w:val="21"/>
+          <w:rtl w:val="0"/>
+        </w:rPr>
+        <w:t xml:space="preserve"> (en desarrollo activo)</w:t>
       </w:r>
       <w:r>
         <w:rPr>

</xml_diff>